<commit_message>
Add Week 9 status update to master spec
</commit_message>
<xml_diff>
--- a/docs/requirements/master-spec.docx
+++ b/docs/requirements/master-spec.docx
@@ -2339,6 +2339,171 @@
           <w:szCs w:val="21"/>
         </w:rPr>
         <w:t xml:space="preserve">13 total interviews (6 Round 1 concept-validation, 7 Round 2 behaviour/motivation) continue to underpin every decision above, most notably: the 5-of-5 independent "inspiration vs. killing time" finding, curator-credibility as the make-or-break adoption factor, and real (not hypothetical) precedent for occasion-based friend coordination. Full transcripts, synthesis, and requirement-to-evidence traceability are maintained as separate research documents.</w:t>
+      </w:r>
+    </w:p>
+    <w:p>
+      <w:r>
+        <w:br w:type="page"/>
+      </w:r>
+    </w:p>
+    <w:p>
+      <w:pPr>
+        <w:pStyle w:val="Heading1"/>
+      </w:pPr>
+      <w:r>
+        <w:t>15. Status Update — Week 9</w:t>
+      </w:r>
+    </w:p>
+    <w:p>
+      <w:pPr>
+        <w:pStyle w:val="Heading2"/>
+      </w:pPr>
+      <w:r>
+        <w:t>15.1 What has been done since this spec was written</w:t>
+      </w:r>
+    </w:p>
+    <w:p>
+      <w:pPr>
+        <w:pStyle w:val="ListParagraph"/>
+      </w:pPr>
+      <w:r>
+        <w:t>•  Prototype built and deployed: React/Vite app implementing onboarding, Today (daily Thread), Archive (Threads/Posts/Saved), Me (profile + status progression), and Curator Studio, live at https://s4899427.github.io/Team_11_Folio/, continuously deployed via GitHub Actions on every push to main.</w:t>
+      </w:r>
+    </w:p>
+    <w:p>
+      <w:pPr>
+        <w:pStyle w:val="ListParagraph"/>
+      </w:pPr>
+      <w:r>
+        <w:t>•  Repository migrated to a new, fully team-collaborable GitHub repo (Team_11_Folio) after a permissions blocker on the original repo; all three members now have push access.</w:t>
+      </w:r>
+    </w:p>
+    <w:p>
+      <w:pPr>
+        <w:pStyle w:val="ListParagraph"/>
+      </w:pPr>
+      <w:r>
+        <w:t>•  In-app feedback capture built (prototype/src/lib/feedback-capture.js): local append-only log by default, with optional real-time sync to a shared Google Sheet via Apps Script (prototype/GOOGLE_SHEETS_SETUP.md), wired through as a GitHub Actions secret so the live build can pick it up once configured.</w:t>
+      </w:r>
+    </w:p>
+    <w:p>
+      <w:pPr>
+        <w:pStyle w:val="ListParagraph"/>
+      </w:pPr>
+      <w:r>
+        <w:t>•  13 interviews completed across two rounds (6 concept-validation, 7 behaviour/motivation), synthesised in docs/research/. Strongest finding: 5/5 Round 2 participants independently distinguished genuine inspiration from passive "killing time" on existing platforms.</w:t>
+      </w:r>
+    </w:p>
+    <w:p>
+      <w:pPr>
+        <w:pStyle w:val="ListParagraph"/>
+      </w:pPr>
+      <w:r>
+        <w:t>•  Week 9 stand-up Wiki page published, full end-to-end manual test of the live build completed with no console errors across onboarding, Today, Archive, and Me.</w:t>
+      </w:r>
+    </w:p>
+    <w:p>
+      <w:pPr>
+        <w:pStyle w:val="ListParagraph"/>
+      </w:pPr>
+      <w:r>
+        <w:t>•  README rewritten with accurate deploy instructions and the real live URL.</w:t>
+      </w:r>
+    </w:p>
+    <w:p>
+      <w:pPr>
+        <w:pStyle w:val="Heading2"/>
+      </w:pPr>
+      <w:r>
+        <w:t>15.2 Known gaps against this spec</w:t>
+      </w:r>
+    </w:p>
+    <w:p>
+      <w:pPr>
+        <w:pStyle w:val="ListParagraph"/>
+      </w:pPr>
+      <w:r>
+        <w:t>•  Section 9.4's Curator Desk rotation mechanism is designed and the Curator Studio UI exists, but has not yet been validated with real users — Round 2 interviews indicate curator credibility is the single condition most participants attached to continued use, so this is the highest-priority thing to test, not to redesign.</w:t>
+      </w:r>
+    </w:p>
+    <w:p>
+      <w:pPr>
+        <w:pStyle w:val="ListParagraph"/>
+      </w:pPr>
+      <w:r>
+        <w:t>•  docs/design/smc-concepts-to-features.md and timeline-ux-spec.md still describe the pre-pivot MOTIF concept (AR dress-up, Drop &amp; Remix, a Nearby/Scene tab) and need to be rewritten against the current Today/Archive/Curator model before final submission.</w:t>
+      </w:r>
+    </w:p>
+    <w:p>
+      <w:pPr>
+        <w:pStyle w:val="ListParagraph"/>
+      </w:pPr>
+      <w:r>
+        <w:t>•  Location-aware content and calendar-significance theme seeding (Section 10) are currently simulated; a live data source (Wikipedia/Wikidata's On This Day API) has been identified but not yet integrated.</w:t>
+      </w:r>
+    </w:p>
+    <w:p>
+      <w:pPr>
+        <w:pStyle w:val="ListParagraph"/>
+      </w:pPr>
+      <w:r>
+        <w:t>•  Ethics Wiki page and Design Process Overview Wiki page are drafted but not yet finalised/posted.</w:t>
+      </w:r>
+    </w:p>
+    <w:p>
+      <w:pPr>
+        <w:pStyle w:val="Heading2"/>
+      </w:pPr>
+      <w:r>
+        <w:t>15.3 Planned before Week 12</w:t>
+      </w:r>
+    </w:p>
+    <w:p>
+      <w:pPr>
+        <w:pStyle w:val="ListParagraph"/>
+      </w:pPr>
+      <w:r>
+        <w:t>•  Real, task-based usability testing of the live build (not just concept-validation interviews), using the built-in feedback flow, specifically targeting whether the Curator Desk mechanism actually reads as credible to first-time users.</w:t>
+      </w:r>
+    </w:p>
+    <w:p>
+      <w:pPr>
+        <w:pStyle w:val="ListParagraph"/>
+      </w:pPr>
+      <w:r>
+        <w:t>•  A2 tradeshow poster (currently only the superseded MOTIF poster exists).</w:t>
+      </w:r>
+    </w:p>
+    <w:p>
+      <w:pPr>
+        <w:pStyle w:val="ListParagraph"/>
+      </w:pPr>
+      <w:r>
+        <w:t>•  Finalise and publish the Ethics Wiki page, structured around the Loke &amp; Matthews (2020) framework or the Ethical Disclaimer canvas.</w:t>
+      </w:r>
+    </w:p>
+    <w:p>
+      <w:pPr>
+        <w:pStyle w:val="ListParagraph"/>
+      </w:pPr>
+      <w:r>
+        <w:t>•  Finalise and publish the Design Process Overview Wiki page.</w:t>
+      </w:r>
+    </w:p>
+    <w:p>
+      <w:pPr>
+        <w:pStyle w:val="ListParagraph"/>
+      </w:pPr>
+      <w:r>
+        <w:t>•  Reconcile docs/design/ with the current build.</w:t>
+      </w:r>
+    </w:p>
+    <w:p>
+      <w:pPr>
+        <w:pStyle w:val="ListParagraph"/>
+      </w:pPr>
+      <w:r>
+        <w:t>•  Lightweight competitive analysis against adjacent human-curated / anti-algorithmic discovery products (Are.na, Cosmos, Savee, Cara, Bandcamp) to sharpen positioning ahead of the tradeshow pitch.</w:t>
       </w:r>
     </w:p>
     <w:sectPr>

</xml_diff>